<commit_message>
docs: regenerate Word features book with finished quota status
Co-Authored-By: Claude Opus 4.8 (1M context) <noreply@anthropic.com>
</commit_message>
<xml_diff>
--- a/docs/VIGMIS_FEATURES_HE.docx
+++ b/docs/VIGMIS_FEATURES_HE.docx
@@ -218,7 +218,6 @@
       <w:r>
         <w:rPr>
           <w:rFonts w:ascii="Consolas" w:hAnsi="Consolas"/>
-          <w:color w:val="8A2B06"/>
         </w:rPr>
         <w:t>client_settings.website_analysis</w:t>
       </w:r>
@@ -433,7 +432,6 @@
       <w:r>
         <w:rPr>
           <w:rFonts w:ascii="Consolas" w:hAnsi="Consolas"/>
-          <w:color w:val="8A2B06"/>
         </w:rPr>
         <w:t>adwords</w:t>
       </w:r>
@@ -510,7 +508,6 @@
       <w:r>
         <w:rPr>
           <w:rFonts w:ascii="Consolas" w:hAnsi="Consolas"/>
-          <w:color w:val="8A2B06"/>
         </w:rPr>
         <w:t>public_profile</w:t>
       </w:r>
@@ -520,7 +517,6 @@
       <w:r>
         <w:rPr>
           <w:rFonts w:ascii="Consolas" w:hAnsi="Consolas"/>
-          <w:color w:val="8A2B06"/>
         </w:rPr>
         <w:t>ads_read</w:t>
       </w:r>
@@ -530,7 +526,6 @@
       <w:r>
         <w:rPr>
           <w:rFonts w:ascii="Consolas" w:hAnsi="Consolas"/>
-          <w:color w:val="8A2B06"/>
         </w:rPr>
         <w:t>ads_management</w:t>
       </w:r>
@@ -540,7 +535,6 @@
       <w:r>
         <w:rPr>
           <w:rFonts w:ascii="Consolas" w:hAnsi="Consolas"/>
-          <w:color w:val="8A2B06"/>
         </w:rPr>
         <w:t>pages_show_list</w:t>
       </w:r>
@@ -550,7 +544,6 @@
       <w:r>
         <w:rPr>
           <w:rFonts w:ascii="Consolas" w:hAnsi="Consolas"/>
-          <w:color w:val="8A2B06"/>
         </w:rPr>
         <w:t>pages_read_engagement</w:t>
       </w:r>
@@ -560,7 +553,6 @@
       <w:r>
         <w:rPr>
           <w:rFonts w:ascii="Consolas" w:hAnsi="Consolas"/>
-          <w:color w:val="8A2B06"/>
         </w:rPr>
         <w:t>pages_manage_posts</w:t>
       </w:r>
@@ -570,7 +562,6 @@
       <w:r>
         <w:rPr>
           <w:rFonts w:ascii="Consolas" w:hAnsi="Consolas"/>
-          <w:color w:val="8A2B06"/>
         </w:rPr>
         <w:t>business_management</w:t>
       </w:r>
@@ -580,7 +571,6 @@
       <w:r>
         <w:rPr>
           <w:rFonts w:ascii="Consolas" w:hAnsi="Consolas"/>
-          <w:color w:val="8A2B06"/>
         </w:rPr>
         <w:t>instagram_basic</w:t>
       </w:r>
@@ -590,7 +580,6 @@
       <w:r>
         <w:rPr>
           <w:rFonts w:ascii="Consolas" w:hAnsi="Consolas"/>
-          <w:color w:val="8A2B06"/>
         </w:rPr>
         <w:t>instagram_content_publish</w:t>
       </w:r>
@@ -600,7 +589,6 @@
       <w:r>
         <w:rPr>
           <w:rFonts w:ascii="Consolas" w:hAnsi="Consolas"/>
-          <w:color w:val="8A2B06"/>
         </w:rPr>
         <w:t>instagram_manage_comments</w:t>
       </w:r>
@@ -643,7 +631,6 @@
       <w:r>
         <w:rPr>
           <w:rFonts w:ascii="Consolas" w:hAnsi="Consolas"/>
-          <w:color w:val="8A2B06"/>
         </w:rPr>
         <w:t>public_profile</w:t>
       </w:r>
@@ -722,7 +709,6 @@
       <w:r>
         <w:rPr>
           <w:rFonts w:ascii="Consolas" w:hAnsi="Consolas"/>
-          <w:color w:val="8A2B06"/>
         </w:rPr>
         <w:t>user.info.basic</w:t>
       </w:r>
@@ -732,7 +718,6 @@
       <w:r>
         <w:rPr>
           <w:rFonts w:ascii="Consolas" w:hAnsi="Consolas"/>
-          <w:color w:val="8A2B06"/>
         </w:rPr>
         <w:t>video.upload</w:t>
       </w:r>
@@ -742,7 +727,6 @@
       <w:r>
         <w:rPr>
           <w:rFonts w:ascii="Consolas" w:hAnsi="Consolas"/>
-          <w:color w:val="8A2B06"/>
         </w:rPr>
         <w:t>video.publish</w:t>
       </w:r>
@@ -847,7 +831,6 @@
       <w:r>
         <w:rPr>
           <w:rFonts w:ascii="Consolas" w:hAnsi="Consolas"/>
-          <w:color w:val="8A2B06"/>
         </w:rPr>
         <w:t>ga4_daily_metrics</w:t>
       </w:r>
@@ -1011,7 +994,6 @@
       <w:r>
         <w:rPr>
           <w:rFonts w:ascii="Consolas" w:hAnsi="Consolas"/>
-          <w:color w:val="8A2B06"/>
         </w:rPr>
         <w:t>client_settings.strategy_plan</w:t>
       </w:r>
@@ -1627,7 +1609,6 @@
       <w:r>
         <w:rPr>
           <w:rFonts w:ascii="Consolas" w:hAnsi="Consolas"/>
-          <w:color w:val="8A2B06"/>
         </w:rPr>
         <w:t>/me/accounts</w:t>
       </w:r>
@@ -1640,7 +1621,6 @@
       <w:r>
         <w:rPr>
           <w:rFonts w:ascii="Consolas" w:hAnsi="Consolas"/>
-          <w:color w:val="8A2B06"/>
         </w:rPr>
         <w:t>/&lt;pageId&gt;?fields=access_token</w:t>
       </w:r>
@@ -1908,7 +1888,6 @@
       <w:r>
         <w:rPr>
           <w:rFonts w:ascii="Consolas" w:hAnsi="Consolas"/>
-          <w:color w:val="8A2B06"/>
         </w:rPr>
         <w:t>/track.js</w:t>
       </w:r>
@@ -1970,7 +1949,6 @@
       <w:r>
         <w:rPr>
           <w:rFonts w:ascii="Consolas" w:hAnsi="Consolas"/>
-          <w:color w:val="8A2B06"/>
         </w:rPr>
         <w:t>https://vigmisapi-production.up.railway.app/track.js?pid=&lt;tenantId&gt;</w:t>
       </w:r>
@@ -2053,7 +2031,6 @@
       <w:r>
         <w:rPr>
           <w:rFonts w:ascii="Consolas" w:hAnsi="Consolas"/>
-          <w:color w:val="8A2B06"/>
         </w:rPr>
         <w:t>${API_URL}/track/shopify/webhook</w:t>
       </w:r>
@@ -2145,7 +2122,6 @@
       <w:r>
         <w:rPr>
           <w:rFonts w:ascii="Consolas" w:hAnsi="Consolas"/>
-          <w:color w:val="8A2B06"/>
         </w:rPr>
         <w:t>usePathname()</w:t>
       </w:r>
@@ -2191,7 +2167,6 @@
       <w:r>
         <w:rPr>
           <w:rFonts w:ascii="Consolas" w:hAnsi="Consolas"/>
-          <w:color w:val="8A2B06"/>
         </w:rPr>
         <w:t>create_post|platform|pillar</w:t>
       </w:r>
@@ -2211,7 +2186,6 @@
       <w:r>
         <w:rPr>
           <w:rFonts w:ascii="Consolas" w:hAnsi="Consolas"/>
-          <w:color w:val="8A2B06"/>
         </w:rPr>
         <w:t>write_post|platform|pillar|text</w:t>
       </w:r>
@@ -2231,7 +2205,6 @@
       <w:r>
         <w:rPr>
           <w:rFonts w:ascii="Consolas" w:hAnsi="Consolas"/>
-          <w:color w:val="8A2B06"/>
         </w:rPr>
         <w:t>edit_post|postId|new_text</w:t>
       </w:r>
@@ -2251,7 +2224,6 @@
       <w:r>
         <w:rPr>
           <w:rFonts w:ascii="Consolas" w:hAnsi="Consolas"/>
-          <w:color w:val="8A2B06"/>
         </w:rPr>
         <w:t>set_post_image|postId|url</w:t>
       </w:r>
@@ -2271,7 +2243,6 @@
       <w:r>
         <w:rPr>
           <w:rFonts w:ascii="Consolas" w:hAnsi="Consolas"/>
-          <w:color w:val="8A2B06"/>
         </w:rPr>
         <w:t>approve_post|postId</w:t>
       </w:r>
@@ -2291,7 +2262,6 @@
       <w:r>
         <w:rPr>
           <w:rFonts w:ascii="Consolas" w:hAnsi="Consolas"/>
-          <w:color w:val="8A2B06"/>
         </w:rPr>
         <w:t>reject_post|postId|reason</w:t>
       </w:r>
@@ -2311,7 +2281,6 @@
       <w:r>
         <w:rPr>
           <w:rFonts w:ascii="Consolas" w:hAnsi="Consolas"/>
-          <w:color w:val="8A2B06"/>
         </w:rPr>
         <w:t>schedule_post|postId|ISO_datetime</w:t>
       </w:r>
@@ -2331,7 +2300,6 @@
       <w:r>
         <w:rPr>
           <w:rFonts w:ascii="Consolas" w:hAnsi="Consolas"/>
-          <w:color w:val="8A2B06"/>
         </w:rPr>
         <w:t>select_ad_account|act_xxx</w:t>
       </w:r>
@@ -2377,7 +2345,6 @@
       <w:r>
         <w:rPr>
           <w:rFonts w:ascii="Consolas" w:hAnsi="Consolas"/>
-          <w:color w:val="8A2B06"/>
         </w:rPr>
         <w:t>social_settings</w:t>
       </w:r>
@@ -2445,7 +2412,6 @@
       <w:r>
         <w:rPr>
           <w:rFonts w:ascii="Consolas" w:hAnsi="Consolas"/>
-          <w:color w:val="8A2B06"/>
         </w:rPr>
         <w:t>website_analysis</w:t>
       </w:r>
@@ -2513,7 +2479,6 @@
       <w:r>
         <w:rPr>
           <w:rFonts w:ascii="Consolas" w:hAnsi="Consolas"/>
-          <w:color w:val="8A2B06"/>
         </w:rPr>
         <w:t>audit_log</w:t>
       </w:r>
@@ -2627,7 +2592,6 @@
       <w:r>
         <w:rPr>
           <w:rFonts w:ascii="Consolas" w:hAnsi="Consolas"/>
-          <w:color w:val="8A2B06"/>
         </w:rPr>
         <w:t>social_settings.facebook_page_id</w:t>
       </w:r>
@@ -2637,7 +2601,6 @@
       <w:r>
         <w:rPr>
           <w:rFonts w:ascii="Consolas" w:hAnsi="Consolas"/>
-          <w:color w:val="8A2B06"/>
         </w:rPr>
         <w:t>instagram_user_id</w:t>
       </w:r>
@@ -2650,7 +2613,6 @@
       <w:r>
         <w:rPr>
           <w:rFonts w:ascii="Consolas" w:hAnsi="Consolas"/>
-          <w:color w:val="8A2B06"/>
         </w:rPr>
         <w:t>platforms</w:t>
       </w:r>
@@ -2707,7 +2669,6 @@
       <w:r>
         <w:rPr>
           <w:rFonts w:ascii="Consolas" w:hAnsi="Consolas"/>
-          <w:color w:val="8A2B06"/>
         </w:rPr>
         <w:t>platform_tokens.account_id</w:t>
       </w:r>
@@ -2720,7 +2681,6 @@
       <w:r>
         <w:rPr>
           <w:rFonts w:ascii="Consolas" w:hAnsi="Consolas"/>
-          <w:color w:val="8A2B06"/>
         </w:rPr>
         <w:t>act_xxx</w:t>
       </w:r>
@@ -2769,7 +2729,6 @@
       <w:r>
         <w:rPr>
           <w:rFonts w:ascii="Consolas" w:hAnsi="Consolas"/>
-          <w:color w:val="8A2B06"/>
         </w:rPr>
         <w:t>ga4_settings</w:t>
       </w:r>
@@ -2808,7 +2767,6 @@
       <w:r>
         <w:rPr>
           <w:rFonts w:ascii="Consolas" w:hAnsi="Consolas"/>
-          <w:color w:val="8A2B06"/>
         </w:rPr>
         <w:t>/connectors/meta/disconnect</w:t>
       </w:r>
@@ -2831,7 +2789,6 @@
       <w:r>
         <w:rPr>
           <w:rFonts w:ascii="Consolas" w:hAnsi="Consolas"/>
-          <w:color w:val="8A2B06"/>
         </w:rPr>
         <w:t>DELETE /me/permissions</w:t>
       </w:r>
@@ -2870,7 +2827,6 @@
       <w:r>
         <w:rPr>
           <w:rFonts w:ascii="Consolas" w:hAnsi="Consolas"/>
-          <w:color w:val="8A2B06"/>
         </w:rPr>
         <w:t>social_settings</w:t>
       </w:r>
@@ -2921,7 +2877,6 @@
       <w:r>
         <w:rPr>
           <w:rFonts w:ascii="Consolas" w:hAnsi="Consolas"/>
-          <w:color w:val="8A2B06"/>
         </w:rPr>
         <w:t>&lt;details&gt;</w:t>
       </w:r>
@@ -2947,7 +2902,6 @@
       <w:r>
         <w:rPr>
           <w:rFonts w:ascii="Consolas" w:hAnsi="Consolas"/>
-          <w:color w:val="8A2B06"/>
         </w:rPr>
         <w:t>pages_manage_posts|publish_to_groups|permission|#100|#200|#10|scope|not allowed</w:t>
       </w:r>
@@ -2983,7 +2937,6 @@
       <w:r>
         <w:rPr>
           <w:rFonts w:ascii="Consolas" w:hAnsi="Consolas"/>
-          <w:color w:val="8A2B06"/>
         </w:rPr>
         <w:t>tenant_id</w:t>
       </w:r>
@@ -3022,7 +2975,6 @@
       <w:r>
         <w:rPr>
           <w:rFonts w:ascii="Consolas" w:hAnsi="Consolas"/>
-          <w:color w:val="8A2B06"/>
         </w:rPr>
         <w:t>tenants</w:t>
       </w:r>
@@ -3035,7 +2987,6 @@
       <w:r>
         <w:rPr>
           <w:rFonts w:ascii="Consolas" w:hAnsi="Consolas"/>
-          <w:color w:val="8A2B06"/>
         </w:rPr>
         <w:t>clerk_user_id</w:t>
       </w:r>
@@ -3142,7 +3093,6 @@
       <w:r>
         <w:rPr>
           <w:rFonts w:ascii="Consolas" w:hAnsi="Consolas"/>
-          <w:color w:val="8A2B06"/>
         </w:rPr>
         <w:t>bidi safety</w:t>
       </w:r>
@@ -3155,7 +3105,6 @@
       <w:r>
         <w:rPr>
           <w:rFonts w:ascii="Consolas" w:hAnsi="Consolas"/>
-          <w:color w:val="8A2B06"/>
         </w:rPr>
         <w:t>&lt;bdi&gt;</w:t>
       </w:r>
@@ -3203,7 +3152,6 @@
       <w:r>
         <w:rPr>
           <w:rFonts w:ascii="Consolas" w:hAnsi="Consolas"/>
-          <w:color w:val="8A2B06"/>
         </w:rPr>
         <w:t>vigmisapi-production.up.railway.app</w:t>
       </w:r>
@@ -3282,7 +3230,6 @@
       <w:r>
         <w:rPr>
           <w:rFonts w:ascii="Consolas" w:hAnsi="Consolas"/>
-          <w:color w:val="8A2B06"/>
         </w:rPr>
         <w:t>tenants</w:t>
       </w:r>
@@ -3292,7 +3239,6 @@
       <w:r>
         <w:rPr>
           <w:rFonts w:ascii="Consolas" w:hAnsi="Consolas"/>
-          <w:color w:val="8A2B06"/>
         </w:rPr>
         <w:t>client_settings</w:t>
       </w:r>
@@ -3302,7 +3248,6 @@
       <w:r>
         <w:rPr>
           <w:rFonts w:ascii="Consolas" w:hAnsi="Consolas"/>
-          <w:color w:val="8A2B06"/>
         </w:rPr>
         <w:t>platform_tokens</w:t>
       </w:r>
@@ -3312,7 +3257,6 @@
       <w:r>
         <w:rPr>
           <w:rFonts w:ascii="Consolas" w:hAnsi="Consolas"/>
-          <w:color w:val="8A2B06"/>
         </w:rPr>
         <w:t>social_settings</w:t>
       </w:r>
@@ -3322,7 +3266,6 @@
       <w:r>
         <w:rPr>
           <w:rFonts w:ascii="Consolas" w:hAnsi="Consolas"/>
-          <w:color w:val="8A2B06"/>
         </w:rPr>
         <w:t>social_posts</w:t>
       </w:r>
@@ -3332,7 +3275,6 @@
       <w:r>
         <w:rPr>
           <w:rFonts w:ascii="Consolas" w:hAnsi="Consolas"/>
-          <w:color w:val="8A2B06"/>
         </w:rPr>
         <w:t>audit_log</w:t>
       </w:r>
@@ -3342,7 +3284,6 @@
       <w:r>
         <w:rPr>
           <w:rFonts w:ascii="Consolas" w:hAnsi="Consolas"/>
-          <w:color w:val="8A2B06"/>
         </w:rPr>
         <w:t>ga4_settings</w:t>
       </w:r>
@@ -3352,7 +3293,6 @@
       <w:r>
         <w:rPr>
           <w:rFonts w:ascii="Consolas" w:hAnsi="Consolas"/>
-          <w:color w:val="8A2B06"/>
         </w:rPr>
         <w:t>ga4_daily_metrics</w:t>
       </w:r>
@@ -3362,7 +3302,6 @@
       <w:r>
         <w:rPr>
           <w:rFonts w:ascii="Consolas" w:hAnsi="Consolas"/>
-          <w:color w:val="8A2B06"/>
         </w:rPr>
         <w:t>campaigns</w:t>
       </w:r>
@@ -3479,7 +3418,6 @@
       <w:r>
         <w:rPr>
           <w:rFonts w:ascii="Consolas" w:hAnsi="Consolas"/>
-          <w:color w:val="8A2B06"/>
         </w:rPr>
         <w:t>?token=</w:t>
       </w:r>
@@ -3568,7 +3506,6 @@
       <w:r>
         <w:rPr>
           <w:rFonts w:ascii="Consolas" w:hAnsi="Consolas"/>
-          <w:color w:val="8A2B06"/>
         </w:rPr>
         <w:t>encryptToken()</w:t>
       </w:r>
@@ -3578,7 +3515,6 @@
       <w:r>
         <w:rPr>
           <w:rFonts w:ascii="Consolas" w:hAnsi="Consolas"/>
-          <w:color w:val="8A2B06"/>
         </w:rPr>
         <w:t>decryptToken()</w:t>
       </w:r>
@@ -3591,7 +3527,6 @@
       <w:r>
         <w:rPr>
           <w:rFonts w:ascii="Consolas" w:hAnsi="Consolas"/>
-          <w:color w:val="8A2B06"/>
         </w:rPr>
         <w:t>@vigmis/db</w:t>
       </w:r>
@@ -3623,7 +3558,6 @@
       <w:r>
         <w:rPr>
           <w:rFonts w:ascii="Consolas" w:hAnsi="Consolas"/>
-          <w:color w:val="8A2B06"/>
         </w:rPr>
         <w:t>audit_log</w:t>
       </w:r>
@@ -3652,7 +3586,6 @@
       <w:r>
         <w:rPr>
           <w:rFonts w:ascii="Consolas" w:hAnsi="Consolas"/>
-          <w:color w:val="8A2B06"/>
         </w:rPr>
         <w:t>crypto.randomBytes(16)</w:t>
       </w:r>
@@ -3733,7 +3666,6 @@
       <w:r>
         <w:rPr>
           <w:rFonts w:ascii="Consolas" w:hAnsi="Consolas"/>
-          <w:color w:val="8A2B06"/>
         </w:rPr>
         <w:t>apps/api/src/billing/pricing.ts</w:t>
       </w:r>
@@ -4969,7 +4901,6 @@
       <w:r>
         <w:rPr>
           <w:rFonts w:ascii="Consolas" w:hAnsi="Consolas"/>
-          <w:color w:val="8A2B06"/>
         </w:rPr>
         <w:t>ai-router</w:t>
       </w:r>
@@ -4982,7 +4913,6 @@
       <w:r>
         <w:rPr>
           <w:rFonts w:ascii="Consolas" w:hAnsi="Consolas"/>
-          <w:color w:val="8A2B06"/>
         </w:rPr>
         <w:t>cost_usd</w:t>
       </w:r>
@@ -5501,7 +5431,6 @@
       <w:r>
         <w:rPr>
           <w:rFonts w:ascii="Consolas" w:hAnsi="Consolas"/>
-          <w:color w:val="8A2B06"/>
         </w:rPr>
         <w:t>packages/ai-router/src/config.ts</w:t>
       </w:r>
@@ -5636,7 +5565,6 @@
       <w:r>
         <w:rPr>
           <w:rFonts w:ascii="Consolas" w:hAnsi="Consolas"/>
-          <w:color w:val="8A2B06"/>
         </w:rPr>
         <w:t>pricing.ts</w:t>
       </w:r>
@@ -5659,7 +5587,6 @@
       <w:r>
         <w:rPr>
           <w:rFonts w:ascii="Consolas" w:hAnsi="Consolas"/>
-          <w:color w:val="8A2B06"/>
         </w:rPr>
         <w:t>calculator.ts</w:t>
       </w:r>
@@ -5682,7 +5609,6 @@
       <w:r>
         <w:rPr>
           <w:rFonts w:ascii="Consolas" w:hAnsi="Consolas"/>
-          <w:color w:val="8A2B06"/>
         </w:rPr>
         <w:t>notifications.ts</w:t>
       </w:r>
@@ -5715,7 +5641,6 @@
       <w:r>
         <w:rPr>
           <w:rFonts w:ascii="Consolas" w:hAnsi="Consolas"/>
-          <w:color w:val="8A2B06"/>
         </w:rPr>
         <w:t>ai_usage_monthly</w:t>
       </w:r>
@@ -5725,7 +5650,6 @@
       <w:r>
         <w:rPr>
           <w:rFonts w:ascii="Consolas" w:hAnsi="Consolas"/>
-          <w:color w:val="8A2B06"/>
         </w:rPr>
         <w:t>bump_ai_usage</w:t>
       </w:r>
@@ -5735,7 +5659,6 @@
       <w:r>
         <w:rPr>
           <w:rFonts w:ascii="Consolas" w:hAnsi="Consolas"/>
-          <w:color w:val="8A2B06"/>
         </w:rPr>
         <w:t>services/usage.ts</w:t>
       </w:r>
@@ -5775,7 +5698,6 @@
       <w:r>
         <w:rPr>
           <w:rFonts w:ascii="Consolas" w:hAnsi="Consolas"/>
-          <w:color w:val="8A2B06"/>
         </w:rPr>
         <w:t>checkChatQuota</w:t>
       </w:r>
@@ -5805,7 +5727,6 @@
       <w:r>
         <w:rPr>
           <w:rFonts w:ascii="Consolas" w:hAnsi="Consolas"/>
-          <w:color w:val="8A2B06"/>
         </w:rPr>
         <w:t>checkCommentQuota</w:t>
       </w:r>
@@ -5835,7 +5756,6 @@
       <w:r>
         <w:rPr>
           <w:rFonts w:ascii="Consolas" w:hAnsi="Consolas"/>
-          <w:color w:val="8A2B06"/>
         </w:rPr>
         <w:t>breakerState</w:t>
       </w:r>
@@ -5848,7 +5768,6 @@
       <w:r>
         <w:rPr>
           <w:rFonts w:ascii="Consolas" w:hAnsi="Consolas"/>
-          <w:color w:val="8A2B06"/>
         </w:rPr>
         <w:t>breaker_state</w:t>
       </w:r>
@@ -5861,7 +5780,6 @@
       <w:r>
         <w:rPr>
           <w:rFonts w:ascii="Consolas" w:hAnsi="Consolas"/>
-          <w:color w:val="8A2B06"/>
         </w:rPr>
         <w:t>OPS_ALERT_EMAIL</w:t>
       </w:r>
@@ -5876,10 +5794,28 @@
         <w:jc w:val="right"/>
       </w:pPr>
       <w:r>
-        <w:rPr>
-          <w:rtl/>
-        </w:rPr>
-        <w:t>⏳ נותר: throttling ברמת cron במצב degrade (השהיית news/weather/insights), ואכיפת תקרות campaigns/channels ב-UI. ה-config מוכן, חסר רק חיווט.</w:t>
+        <w:t xml:space="preserve">✅ </w:t>
+      </w:r>
+      <w:r>
+        <w:rPr>
+          <w:b/>
+        </w:rPr>
+        <w:t>Cron throttling</w:t>
+      </w:r>
+      <w:r>
+        <w:t xml:space="preserve"> — </w:t>
+      </w:r>
+      <w:r>
+        <w:rPr>
+          <w:rFonts w:ascii="Consolas" w:hAnsi="Consolas"/>
+        </w:rPr>
+        <w:t>isThrottled()</w:t>
+      </w:r>
+      <w:r>
+        <w:rPr>
+          <w:rtl/>
+        </w:rPr>
+        <w:t xml:space="preserve"> מדלג על לקוחות ב-degrade/freeze ב-crons הלא-חיוניים (news-scan, weather, comments-insights).</w:t>
       </w:r>
     </w:p>
     <w:p>
@@ -5889,6 +5825,69 @@
         <w:jc w:val="right"/>
       </w:pPr>
       <w:r>
+        <w:t xml:space="preserve">✅ </w:t>
+      </w:r>
+      <w:r>
+        <w:rPr>
+          <w:b/>
+          <w:rtl/>
+        </w:rPr>
+        <w:t>תקרת קמפיינים</w:t>
+      </w:r>
+      <w:r>
+        <w:t xml:space="preserve"> — </w:t>
+      </w:r>
+      <w:r>
+        <w:rPr>
+          <w:rFonts w:ascii="Consolas" w:hAnsi="Consolas"/>
+        </w:rPr>
+        <w:t>/campaigns/launch</w:t>
+      </w:r>
+      <w:r>
+        <w:rPr>
+          <w:rtl/>
+        </w:rPr>
+        <w:t xml:space="preserve"> חוסם כשמספר הקמפיינים הפעילים מגיע למכסת המדרגה.</w:t>
+      </w:r>
+    </w:p>
+    <w:p>
+      <w:pPr>
+        <w:pStyle w:val="ListBullet"/>
+        <w:bidi/>
+        <w:jc w:val="right"/>
+      </w:pPr>
+      <w:r>
+        <w:t xml:space="preserve">✅ </w:t>
+      </w:r>
+      <w:r>
+        <w:rPr>
+          <w:b/>
+        </w:rPr>
+        <w:t>UI</w:t>
+      </w:r>
+      <w:r>
+        <w:t xml:space="preserve"> — </w:t>
+      </w:r>
+      <w:r>
+        <w:rPr>
+          <w:rFonts w:ascii="Consolas" w:hAnsi="Consolas"/>
+        </w:rPr>
+        <w:t>GET /billing/usage</w:t>
+      </w:r>
+      <w:r>
+        <w:rPr>
+          <w:rtl/>
+        </w:rPr>
+        <w:t xml:space="preserve"> + widget "Usage &amp; Limits" בעמוד Billing (conversations/comments מול מכסה, breaker banner, tier). מחירי המסלולים עודכנו (Starter 7%/$29, Pro $49+6%).</w:t>
+      </w:r>
+    </w:p>
+    <w:p>
+      <w:pPr>
+        <w:pStyle w:val="ListBullet"/>
+        <w:bidi/>
+        <w:jc w:val="right"/>
+      </w:pPr>
+      <w:r>
         <w:t xml:space="preserve">⏳ </w:t>
       </w:r>
       <w:r>
@@ -5902,7 +5901,7 @@
         <w:rPr>
           <w:rtl/>
         </w:rPr>
-        <w:t xml:space="preserve"> להריץ migration 039 על Supabase.</w:t>
+        <w:t xml:space="preserve"> להריץ migrations 023–039 על Supabase (service-role key לא מריץ DDL).</w:t>
       </w:r>
     </w:p>
     <w:p>
@@ -5937,7 +5936,6 @@
       <w:r>
         <w:rPr>
           <w:rFonts w:ascii="Consolas" w:hAnsi="Consolas"/>
-          <w:color w:val="8A2B06"/>
         </w:rPr>
         <w:t>apps/web/vercel.json</w:t>
       </w:r>
@@ -6323,7 +6321,6 @@
       <w:r>
         <w:rPr>
           <w:rFonts w:ascii="Consolas" w:hAnsi="Consolas"/>
-          <w:color w:val="8A2B06"/>
         </w:rPr>
         <w:t>apps/api/src/services/significance.ts</w:t>
       </w:r>
@@ -6338,7 +6335,6 @@
       <w:r>
         <w:rPr>
           <w:rFonts w:ascii="Consolas" w:hAnsi="Consolas"/>
-          <w:color w:val="8A2B06"/>
         </w:rPr>
         <w:t>safeToScaleUp</w:t>
       </w:r>
@@ -6348,7 +6344,6 @@
       <w:r>
         <w:rPr>
           <w:rFonts w:ascii="Consolas" w:hAnsi="Consolas"/>
-          <w:color w:val="8A2B06"/>
         </w:rPr>
         <w:t>safeToScaleDown</w:t>
       </w:r>
@@ -6365,7 +6360,6 @@
       <w:r>
         <w:rPr>
           <w:rFonts w:ascii="Consolas" w:hAnsi="Consolas"/>
-          <w:color w:val="8A2B06"/>
         </w:rPr>
         <w:t>proportionsDiffer</w:t>
       </w:r>
@@ -6391,7 +6385,6 @@
       <w:r>
         <w:rPr>
           <w:rFonts w:ascii="Consolas" w:hAnsi="Consolas"/>
-          <w:color w:val="8A2B06"/>
         </w:rPr>
         <w:t>apps/api/src/optimization/rules.ts</w:t>
       </w:r>
@@ -6424,7 +6417,6 @@
       <w:r>
         <w:rPr>
           <w:rFonts w:ascii="Consolas" w:hAnsi="Consolas"/>
-          <w:color w:val="8A2B06"/>
         </w:rPr>
         <w:t>apps/api/src/services/incrementality.ts</w:t>
       </w:r>
@@ -6465,7 +6457,6 @@
       <w:r>
         <w:rPr>
           <w:rFonts w:ascii="Consolas" w:hAnsi="Consolas"/>
-          <w:color w:val="8A2B06"/>
         </w:rPr>
         <w:t>packages/ad-connectors/src/ga4/index.ts</w:t>
       </w:r>
@@ -6478,7 +6469,6 @@
       <w:r>
         <w:rPr>
           <w:rFonts w:ascii="Consolas" w:hAnsi="Consolas"/>
-          <w:color w:val="8A2B06"/>
         </w:rPr>
         <w:t>routes/ga4.ts</w:t>
       </w:r>
@@ -6517,7 +6507,6 @@
       <w:r>
         <w:rPr>
           <w:rFonts w:ascii="Consolas" w:hAnsi="Consolas"/>
-          <w:color w:val="8A2B06"/>
         </w:rPr>
         <w:t>apps/api/src/services/creative-brief.ts</w:t>
       </w:r>
@@ -6574,7 +6563,6 @@
       <w:r>
         <w:rPr>
           <w:rFonts w:ascii="Consolas" w:hAnsi="Consolas"/>
-          <w:color w:val="8A2B06"/>
         </w:rPr>
         <w:t>client_settings.brand_voice_profile</w:t>
       </w:r>
@@ -6589,7 +6577,6 @@
       <w:r>
         <w:rPr>
           <w:rFonts w:ascii="Consolas" w:hAnsi="Consolas"/>
-          <w:color w:val="8A2B06"/>
         </w:rPr>
         <w:t>apps/api/src/services/brand-voice.ts</w:t>
       </w:r>
@@ -6651,7 +6638,6 @@
       <w:r>
         <w:rPr>
           <w:rFonts w:ascii="Consolas" w:hAnsi="Consolas"/>
-          <w:color w:val="8A2B06"/>
         </w:rPr>
         <w:t>apps/api/src/services/briefings.ts</w:t>
       </w:r>
@@ -6679,7 +6665,6 @@
       <w:r>
         <w:rPr>
           <w:rFonts w:ascii="Consolas" w:hAnsi="Consolas"/>
-          <w:color w:val="8A2B06"/>
         </w:rPr>
         <w:t>apps/api/src/routes/briefings.ts</w:t>
       </w:r>
@@ -6702,7 +6687,6 @@
       <w:r>
         <w:rPr>
           <w:rFonts w:ascii="Consolas" w:hAnsi="Consolas"/>
-          <w:color w:val="8A2B06"/>
         </w:rPr>
         <w:t>apps/web/vercel.json</w:t>
       </w:r>
@@ -6755,7 +6739,6 @@
       <w:r>
         <w:rPr>
           <w:rFonts w:ascii="Consolas" w:hAnsi="Consolas"/>
-          <w:color w:val="8A2B06"/>
         </w:rPr>
         <w:t>apps/api/src/services/conversion-readiness.ts</w:t>
       </w:r>
@@ -6770,7 +6753,6 @@
       <w:r>
         <w:rPr>
           <w:rFonts w:ascii="Consolas" w:hAnsi="Consolas"/>
-          <w:color w:val="8A2B06"/>
         </w:rPr>
         <w:t>apps/api/src/routes/readiness.ts</w:t>
       </w:r>
@@ -6793,7 +6775,6 @@
       <w:r>
         <w:rPr>
           <w:rFonts w:ascii="Consolas" w:hAnsi="Consolas"/>
-          <w:color w:val="8A2B06"/>
         </w:rPr>
         <w:t>/campaigns/launch</w:t>
       </w:r>
@@ -6852,7 +6833,6 @@
       <w:r>
         <w:rPr>
           <w:rFonts w:ascii="Consolas" w:hAnsi="Consolas"/>
-          <w:color w:val="8A2B06"/>
         </w:rPr>
         <w:t>apps/api/src/services/metric-interpreter.ts</w:t>
       </w:r>
@@ -6952,7 +6932,6 @@
       <w:r>
         <w:rPr>
           <w:rFonts w:ascii="Consolas" w:hAnsi="Consolas"/>
-          <w:color w:val="8A2B06"/>
         </w:rPr>
         <w:t>apps/api/src/services/operational-awareness.ts</w:t>
       </w:r>
@@ -6980,7 +6959,6 @@
       <w:r>
         <w:rPr>
           <w:rFonts w:ascii="Consolas" w:hAnsi="Consolas"/>
-          <w:color w:val="8A2B06"/>
         </w:rPr>
         <w:t>apps/api/src/services/news-monitor.ts</w:t>
       </w:r>
@@ -6990,7 +6968,6 @@
       <w:r>
         <w:rPr>
           <w:rFonts w:ascii="Consolas" w:hAnsi="Consolas"/>
-          <w:color w:val="8A2B06"/>
         </w:rPr>
         <w:t>/ops/cron/news-scan</w:t>
       </w:r>
@@ -7013,7 +6990,6 @@
       <w:r>
         <w:rPr>
           <w:rFonts w:ascii="Consolas" w:hAnsi="Consolas"/>
-          <w:color w:val="8A2B06"/>
         </w:rPr>
         <w:t>apps/api/src/services/weather.ts</w:t>
       </w:r>
@@ -7023,7 +6999,6 @@
       <w:r>
         <w:rPr>
           <w:rFonts w:ascii="Consolas" w:hAnsi="Consolas"/>
-          <w:color w:val="8A2B06"/>
         </w:rPr>
         <w:t>/ops/cron/weather</w:t>
       </w:r>
@@ -7033,7 +7008,6 @@
       <w:r>
         <w:rPr>
           <w:rFonts w:ascii="Consolas" w:hAnsi="Consolas"/>
-          <w:color w:val="8A2B06"/>
         </w:rPr>
         <w:t>/ops/weather-sensitivity</w:t>
       </w:r>
@@ -7083,7 +7057,6 @@
       <w:r>
         <w:rPr>
           <w:rFonts w:ascii="Consolas" w:hAnsi="Consolas"/>
-          <w:color w:val="8A2B06"/>
         </w:rPr>
         <w:t>apps/api/src/services/intent-router.ts</w:t>
       </w:r>
@@ -7108,7 +7081,6 @@
       <w:r>
         <w:rPr>
           <w:rFonts w:ascii="Consolas" w:hAnsi="Consolas"/>
-          <w:color w:val="8A2B06"/>
         </w:rPr>
         <w:t>/chat</w:t>
       </w:r>
@@ -7349,7 +7321,6 @@
       <w:r>
         <w:rPr>
           <w:rFonts w:ascii="Consolas" w:hAnsi="Consolas"/>
-          <w:color w:val="8A2B06"/>
         </w:rPr>
         <w:t>apps/api/src/services/policy-classifier.ts</w:t>
       </w:r>
@@ -7368,7 +7339,6 @@
       <w:r>
         <w:rPr>
           <w:rFonts w:ascii="Consolas" w:hAnsi="Consolas"/>
-          <w:color w:val="8A2B06"/>
         </w:rPr>
         <w:t>apps/api/src/services/policy-gate.ts</w:t>
       </w:r>
@@ -7381,7 +7351,6 @@
       <w:r>
         <w:rPr>
           <w:rFonts w:ascii="Consolas" w:hAnsi="Consolas"/>
-          <w:color w:val="8A2B06"/>
         </w:rPr>
         <w:t>content_decisions</w:t>
       </w:r>
@@ -7393,7 +7362,6 @@
       <w:r>
         <w:rPr>
           <w:rFonts w:ascii="Consolas" w:hAnsi="Consolas"/>
-          <w:color w:val="8A2B06"/>
         </w:rPr>
         <w:t>apps/api/src/services/geo-context.ts</w:t>
       </w:r>
@@ -7852,7 +7820,6 @@
       <w:r>
         <w:rPr>
           <w:rFonts w:ascii="Consolas" w:hAnsi="Consolas"/>
-          <w:color w:val="8A2B06"/>
         </w:rPr>
         <w:t>apps/web/app/components/AttestationCheckbox.tsx</w:t>
       </w:r>
@@ -7862,7 +7829,6 @@
       <w:r>
         <w:rPr>
           <w:rFonts w:ascii="Consolas" w:hAnsi="Consolas"/>
-          <w:color w:val="8A2B06"/>
         </w:rPr>
         <w:t>attestation-actions.ts</w:t>
       </w:r>
@@ -7874,7 +7840,6 @@
       <w:r>
         <w:rPr>
           <w:rFonts w:ascii="Consolas" w:hAnsi="Consolas"/>
-          <w:color w:val="8A2B06"/>
         </w:rPr>
         <w:t>apps/api/src/routes/attestations.ts</w:t>
       </w:r>
@@ -7915,7 +7880,6 @@
       <w:r>
         <w:rPr>
           <w:rFonts w:ascii="Consolas" w:hAnsi="Consolas"/>
-          <w:color w:val="8A2B06"/>
         </w:rPr>
         <w:t>apps/api/src/services/approval-snapshot.ts</w:t>
       </w:r>
@@ -7956,7 +7920,6 @@
       <w:r>
         <w:rPr>
           <w:rFonts w:ascii="Consolas" w:hAnsi="Consolas"/>
-          <w:color w:val="8A2B06"/>
         </w:rPr>
         <w:t>apps/api/src/services/policy-classifier.ts</w:t>
       </w:r>
@@ -7971,7 +7934,6 @@
       <w:r>
         <w:rPr>
           <w:rFonts w:ascii="Consolas" w:hAnsi="Consolas"/>
-          <w:color w:val="8A2B06"/>
         </w:rPr>
         <w:t>apps/api/src/routes/policy.ts</w:t>
       </w:r>
@@ -7991,7 +7953,6 @@
       <w:r>
         <w:rPr>
           <w:rFonts w:ascii="Consolas" w:hAnsi="Consolas"/>
-          <w:color w:val="8A2B06"/>
         </w:rPr>
         <w:t>apps/api/src/services/ai-disclosure.ts</w:t>
       </w:r>
@@ -8053,7 +8014,6 @@
       <w:r>
         <w:rPr>
           <w:rFonts w:ascii="Consolas" w:hAnsi="Consolas"/>
-          <w:color w:val="8A2B06"/>
         </w:rPr>
         <w:t>content_decisions</w:t>
       </w:r>
@@ -8068,7 +8028,6 @@
       <w:r>
         <w:rPr>
           <w:rFonts w:ascii="Consolas" w:hAnsi="Consolas"/>
-          <w:color w:val="8A2B06"/>
         </w:rPr>
         <w:t>apps/api/src/routes/explainability.ts</w:t>
       </w:r>
@@ -8114,7 +8073,6 @@
       <w:r>
         <w:rPr>
           <w:rFonts w:ascii="Consolas" w:hAnsi="Consolas"/>
-          <w:color w:val="8A2B06"/>
         </w:rPr>
         <w:t>apps/api/src/services/truth-verifier.ts</w:t>
       </w:r>
@@ -8158,7 +8116,6 @@
       <w:r>
         <w:rPr>
           <w:rFonts w:ascii="Consolas" w:hAnsi="Consolas"/>
-          <w:color w:val="8A2B06"/>
         </w:rPr>
         <w:t>apps/api/src/services/shopify-sync.ts</w:t>
       </w:r>
@@ -8181,7 +8138,6 @@
       <w:r>
         <w:rPr>
           <w:rFonts w:ascii="Consolas" w:hAnsi="Consolas"/>
-          <w:color w:val="8A2B06"/>
         </w:rPr>
         <w:t>/track/shopify/callback</w:t>
       </w:r>
@@ -8204,7 +8160,6 @@
       <w:r>
         <w:rPr>
           <w:rFonts w:ascii="Consolas" w:hAnsi="Consolas"/>
-          <w:color w:val="8A2B06"/>
         </w:rPr>
         <w:t>/track/shopify/products-webhook</w:t>
       </w:r>
@@ -8227,7 +8182,6 @@
       <w:r>
         <w:rPr>
           <w:rFonts w:ascii="Consolas" w:hAnsi="Consolas"/>
-          <w:color w:val="8A2B06"/>
         </w:rPr>
         <w:t>/api/cron/shopify-sync</w:t>
       </w:r>
@@ -8258,7 +8212,6 @@
       <w:r>
         <w:rPr>
           <w:rFonts w:ascii="Consolas" w:hAnsi="Consolas"/>
-          <w:color w:val="8A2B06"/>
         </w:rPr>
         <w:t>apps/api/src/services/trust-tier.ts</w:t>
       </w:r>
@@ -8312,7 +8265,6 @@
       <w:r>
         <w:rPr>
           <w:rFonts w:ascii="Consolas" w:hAnsi="Consolas"/>
-          <w:color w:val="8A2B06"/>
         </w:rPr>
         <w:t>/compliance/cron/recompute-trust</w:t>
       </w:r>
@@ -8335,7 +8287,6 @@
       <w:r>
         <w:rPr>
           <w:rFonts w:ascii="Consolas" w:hAnsi="Consolas"/>
-          <w:color w:val="8A2B06"/>
         </w:rPr>
         <w:t>apps/api/src/services/re-attestation.ts</w:t>
       </w:r>
@@ -8368,7 +8319,6 @@
       <w:r>
         <w:rPr>
           <w:rFonts w:ascii="Consolas" w:hAnsi="Consolas"/>
-          <w:color w:val="8A2B06"/>
         </w:rPr>
         <w:t>/api/cron/reattestation</w:t>
       </w:r>
@@ -8391,7 +8341,6 @@
       <w:r>
         <w:rPr>
           <w:rFonts w:ascii="Consolas" w:hAnsi="Consolas"/>
-          <w:color w:val="8A2B06"/>
         </w:rPr>
         <w:t>apps/api/src/services/two-key.ts</w:t>
       </w:r>
@@ -8430,7 +8379,6 @@
       <w:r>
         <w:rPr>
           <w:rFonts w:ascii="Consolas" w:hAnsi="Consolas"/>
-          <w:color w:val="8A2B06"/>
         </w:rPr>
         <w:t>/social/posts/:id/approve</w:t>
       </w:r>
@@ -8463,7 +8411,6 @@
       <w:r>
         <w:rPr>
           <w:rFonts w:ascii="Consolas" w:hAnsi="Consolas"/>
-          <w:color w:val="8A2B06"/>
         </w:rPr>
         <w:t>apps/api/src/services/high-stakes-detector.ts</w:t>
       </w:r>
@@ -8496,7 +8443,6 @@
       <w:r>
         <w:rPr>
           <w:rFonts w:ascii="Consolas" w:hAnsi="Consolas"/>
-          <w:color w:val="8A2B06"/>
         </w:rPr>
         <w:t>/social/posts/:id/cancel-cooling-off</w:t>
       </w:r>
@@ -8521,7 +8467,6 @@
       <w:r>
         <w:rPr>
           <w:rFonts w:ascii="Consolas" w:hAnsi="Consolas"/>
-          <w:color w:val="8A2B06"/>
         </w:rPr>
         <w:t>apps/api/src/services/industry-gates.ts</w:t>
       </w:r>
@@ -8578,7 +8523,6 @@
       <w:r>
         <w:rPr>
           <w:rFonts w:ascii="Consolas" w:hAnsi="Consolas"/>
-          <w:color w:val="8A2B06"/>
         </w:rPr>
         <w:t>apps/api/src/routes/admin.ts</w:t>
       </w:r>
@@ -8598,7 +8542,6 @@
       <w:r>
         <w:rPr>
           <w:rFonts w:ascii="Consolas" w:hAnsi="Consolas"/>
-          <w:color w:val="8A2B06"/>
         </w:rPr>
         <w:t>ADMIN_SECRET</w:t>
       </w:r>
@@ -8618,7 +8561,6 @@
       <w:r>
         <w:rPr>
           <w:rFonts w:ascii="Consolas" w:hAnsi="Consolas"/>
-          <w:color w:val="8A2B06"/>
         </w:rPr>
         <w:t>isFrozenFor(tenantId, capability)</w:t>
       </w:r>
@@ -8641,7 +8583,6 @@
       <w:r>
         <w:rPr>
           <w:rFonts w:ascii="Consolas" w:hAnsi="Consolas"/>
-          <w:color w:val="8A2B06"/>
         </w:rPr>
         <w:t>apps/api/src/routes/explainability.ts</w:t>
       </w:r>
@@ -8674,7 +8615,6 @@
       <w:r>
         <w:rPr>
           <w:rFonts w:ascii="Consolas" w:hAnsi="Consolas"/>
-          <w:color w:val="8A2B06"/>
         </w:rPr>
         <w:t>apps/api/src/services/stop-loss.ts</w:t>
       </w:r>
@@ -8715,7 +8655,6 @@
       <w:r>
         <w:rPr>
           <w:rFonts w:ascii="Consolas" w:hAnsi="Consolas"/>
-          <w:color w:val="8A2B06"/>
         </w:rPr>
         <w:t>/api/cron/stop-loss</w:t>
       </w:r>
@@ -9212,7 +9151,6 @@
       <w:r>
         <w:rPr>
           <w:rFonts w:ascii="Consolas" w:hAnsi="Consolas"/>
-          <w:color w:val="8A2B06"/>
         </w:rPr>
         <w:t>apps/api/src/routes/admin.ts</w:t>
       </w:r>
@@ -9250,7 +9188,6 @@
       <w:r>
         <w:rPr>
           <w:rFonts w:ascii="Consolas" w:hAnsi="Consolas"/>
-          <w:color w:val="8A2B06"/>
         </w:rPr>
         <w:t>isFrozenFor(tenantId, capability)</w:t>
       </w:r>
@@ -9278,7 +9215,6 @@
       <w:r>
         <w:rPr>
           <w:rFonts w:ascii="Consolas" w:hAnsi="Consolas"/>
-          <w:color w:val="8A2B06"/>
         </w:rPr>
         <w:t>content_decisions</w:t>
       </w:r>
@@ -9296,7 +9232,6 @@
       <w:r>
         <w:rPr>
           <w:rFonts w:ascii="Consolas" w:hAnsi="Consolas"/>
-          <w:color w:val="8A2B06"/>
         </w:rPr>
         <w:t>approval_snapshots</w:t>
       </w:r>
@@ -9313,7 +9248,6 @@
       <w:r>
         <w:rPr>
           <w:rFonts w:ascii="Consolas" w:hAnsi="Consolas"/>
-          <w:color w:val="8A2B06"/>
         </w:rPr>
         <w:t>content_attestations</w:t>
       </w:r>
@@ -9331,7 +9265,6 @@
       <w:r>
         <w:rPr>
           <w:rFonts w:ascii="Consolas" w:hAnsi="Consolas"/>
-          <w:color w:val="8A2B06"/>
         </w:rPr>
         <w:t>bypass_attempts</w:t>
       </w:r>
@@ -9346,7 +9279,6 @@
       <w:r>
         <w:rPr>
           <w:rFonts w:ascii="Consolas" w:hAnsi="Consolas"/>
-          <w:color w:val="8A2B06"/>
         </w:rPr>
         <w:t>tenant_trust_tier</w:t>
       </w:r>
@@ -9361,7 +9293,6 @@
       <w:r>
         <w:rPr>
           <w:rFonts w:ascii="Consolas" w:hAnsi="Consolas"/>
-          <w:color w:val="8A2B06"/>
         </w:rPr>
         <w:t>briefing_log</w:t>
       </w:r>
@@ -9376,7 +9307,6 @@
       <w:r>
         <w:rPr>
           <w:rFonts w:ascii="Consolas" w:hAnsi="Consolas"/>
-          <w:color w:val="8A2B06"/>
         </w:rPr>
         <w:t>sentiment_velocity_snapshot</w:t>
       </w:r>
@@ -9391,7 +9321,6 @@
       <w:r>
         <w:rPr>
           <w:rFonts w:ascii="Consolas" w:hAnsi="Consolas"/>
-          <w:color w:val="8A2B06"/>
         </w:rPr>
         <w:t>comment_insights</w:t>
       </w:r>
@@ -9401,7 +9330,6 @@
       <w:r>
         <w:rPr>
           <w:rFonts w:ascii="Consolas" w:hAnsi="Consolas"/>
-          <w:color w:val="8A2B06"/>
         </w:rPr>
         <w:t>reply_outcomes</w:t>
       </w:r>
@@ -9416,7 +9344,6 @@
       <w:r>
         <w:rPr>
           <w:rFonts w:ascii="Consolas" w:hAnsi="Consolas"/>
-          <w:color w:val="8A2B06"/>
         </w:rPr>
         <w:t>reply_override_log</w:t>
       </w:r>
@@ -9485,7 +9412,6 @@
       <w:r>
         <w:rPr>
           <w:rFonts w:ascii="Consolas" w:hAnsi="Consolas"/>
-          <w:color w:val="8A2B06"/>
         </w:rPr>
         <w:t>social-comments.ts</w:t>
       </w:r>
@@ -9610,7 +9536,6 @@
       <w:r>
         <w:rPr>
           <w:rFonts w:ascii="Consolas" w:hAnsi="Consolas"/>
-          <w:color w:val="8A2B06"/>
         </w:rPr>
         <w:t>apps/api/src/services/reply-override-learning.ts</w:t>
       </w:r>
@@ -9636,7 +9561,6 @@
       <w:r>
         <w:rPr>
           <w:rFonts w:ascii="Consolas" w:hAnsi="Consolas"/>
-          <w:color w:val="8A2B06"/>
         </w:rPr>
         <w:t>apps/api/src/services/comment-priority.ts</w:t>
       </w:r>
@@ -9653,7 +9577,6 @@
       <w:r>
         <w:rPr>
           <w:rFonts w:ascii="Consolas" w:hAnsi="Consolas"/>
-          <w:color w:val="8A2B06"/>
         </w:rPr>
         <w:t>apps/api/src/services/lead-digest.ts</w:t>
       </w:r>
@@ -9689,7 +9612,6 @@
       <w:r>
         <w:rPr>
           <w:rFonts w:ascii="Consolas" w:hAnsi="Consolas"/>
-          <w:color w:val="8A2B06"/>
         </w:rPr>
         <w:t>/api/cron/comments-digest</w:t>
       </w:r>
@@ -9723,7 +9645,6 @@
       <w:r>
         <w:rPr>
           <w:rFonts w:ascii="Consolas" w:hAnsi="Consolas"/>
-          <w:color w:val="8A2B06"/>
         </w:rPr>
         <w:t>apps/api/src/services/sentiment-velocity.ts</w:t>
       </w:r>
@@ -9801,7 +9722,6 @@
       <w:r>
         <w:rPr>
           <w:rFonts w:ascii="Consolas" w:hAnsi="Consolas"/>
-          <w:color w:val="8A2B06"/>
         </w:rPr>
         <w:t>apps/api/src/services/comment-insights.ts</w:t>
       </w:r>
@@ -9830,7 +9750,6 @@
       <w:r>
         <w:rPr>
           <w:rFonts w:ascii="Consolas" w:hAnsi="Consolas"/>
-          <w:color w:val="8A2B06"/>
         </w:rPr>
         <w:t>/api/cron/comments-insights</w:t>
       </w:r>
@@ -11318,7 +11237,6 @@
       <w:r>
         <w:rPr>
           <w:rFonts w:ascii="Consolas" w:hAnsi="Consolas"/>
-          <w:color w:val="8A2B06"/>
         </w:rPr>
         <w:t>apps/web</w:t>
       </w:r>
@@ -11328,7 +11246,6 @@
       <w:r>
         <w:rPr>
           <w:rFonts w:ascii="Consolas" w:hAnsi="Consolas"/>
-          <w:color w:val="8A2B06"/>
         </w:rPr>
         <w:t>apps/api</w:t>
       </w:r>
@@ -11346,7 +11263,6 @@
       <w:r>
         <w:rPr>
           <w:rFonts w:ascii="Consolas" w:hAnsi="Consolas"/>
-          <w:color w:val="8A2B06"/>
         </w:rPr>
         <w:t>@vigmis/db</w:t>
       </w:r>
@@ -11356,7 +11272,6 @@
       <w:r>
         <w:rPr>
           <w:rFonts w:ascii="Consolas" w:hAnsi="Consolas"/>
-          <w:color w:val="8A2B06"/>
         </w:rPr>
         <w:t>@vigmis/ad-connectors</w:t>
       </w:r>
@@ -11366,7 +11281,6 @@
       <w:r>
         <w:rPr>
           <w:rFonts w:ascii="Consolas" w:hAnsi="Consolas"/>
-          <w:color w:val="8A2B06"/>
         </w:rPr>
         <w:t>@vigmis/ai-router</w:t>
       </w:r>
@@ -11376,7 +11290,6 @@
       <w:r>
         <w:rPr>
           <w:rFonts w:ascii="Consolas" w:hAnsi="Consolas"/>
-          <w:color w:val="8A2B06"/>
         </w:rPr>
         <w:t>@vigmis/config</w:t>
       </w:r>

</xml_diff>

<commit_message>
docs: migrations 023-039 applied to Supabase; update code stats
Co-Authored-By: Claude Opus 4.8 (1M context) <noreply@anthropic.com>
</commit_message>
<xml_diff>
--- a/docs/VIGMIS_FEATURES_HE.docx
+++ b/docs/VIGMIS_FEATURES_HE.docx
@@ -5888,20 +5888,41 @@
         <w:jc w:val="right"/>
       </w:pPr>
       <w:r>
-        <w:t xml:space="preserve">⏳ </w:t>
+        <w:t xml:space="preserve">✅ </w:t>
       </w:r>
       <w:r>
         <w:rPr>
           <w:b/>
           <w:rtl/>
         </w:rPr>
-        <w:t>חיצוני (Ami):</w:t>
-      </w:r>
-      <w:r>
-        <w:rPr>
-          <w:rtl/>
-        </w:rPr>
-        <w:t xml:space="preserve"> להריץ migrations 023–039 על Supabase (service-role key לא מריץ DDL).</w:t>
+        <w:t>migrations 023–039 הורצו על Supabase</w:t>
+      </w:r>
+      <w:r>
+        <w:rPr>
+          <w:rtl/>
+        </w:rPr>
+        <w:t xml:space="preserve"> (2026-05-30, דרך Management API — 17 קבצים, 0 שגיאות). </w:t>
+      </w:r>
+      <w:r>
+        <w:rPr>
+          <w:rFonts w:ascii="Consolas" w:hAnsi="Consolas"/>
+        </w:rPr>
+        <w:t>ai_usage_monthly</w:t>
+      </w:r>
+      <w:r>
+        <w:t xml:space="preserve"> + </w:t>
+      </w:r>
+      <w:r>
+        <w:rPr>
+          <w:rFonts w:ascii="Consolas" w:hAnsi="Consolas"/>
+        </w:rPr>
+        <w:t>bump_ai_usage</w:t>
+      </w:r>
+      <w:r>
+        <w:rPr>
+          <w:rtl/>
+        </w:rPr>
+        <w:t xml:space="preserve"> פעילים.</w:t>
       </w:r>
     </w:p>
     <w:p>
@@ -11305,10 +11326,10 @@
         <w:rPr>
           <w:b/>
         </w:rPr>
-        <w:t>38 migrations</w:t>
-      </w:r>
-      <w:r>
-        <w:t xml:space="preserve"> (001 → 038).</w:t>
+        <w:t>39 migrations</w:t>
+      </w:r>
+      <w:r>
+        <w:t xml:space="preserve"> (001 → 039).</w:t>
       </w:r>
     </w:p>
     <w:p>
@@ -11321,7 +11342,7 @@
         <w:rPr>
           <w:b/>
         </w:rPr>
-        <w:t>36+ routes</w:t>
+        <w:t>37+ routes</w:t>
       </w:r>
       <w:r>
         <w:rPr>
@@ -11340,7 +11361,7 @@
         <w:rPr>
           <w:b/>
         </w:rPr>
-        <w:t>27+ services</w:t>
+        <w:t>28+ services</w:t>
       </w:r>
       <w:r>
         <w:rPr>
@@ -11359,7 +11380,7 @@
         <w:rPr>
           <w:b/>
         </w:rPr>
-        <w:t>18 crons</w:t>
+        <w:t>24 crons</w:t>
       </w:r>
       <w:r>
         <w:rPr>
@@ -11381,7 +11402,7 @@
         <w:pStyle w:val="ListBullet"/>
       </w:pPr>
       <w:r>
-        <w:t>DB: ✅ 38/38 migrations applied to Supabase, schema in sync.</w:t>
+        <w:t>DB: ✅ 39/39 migrations applied to Supabase, schema in sync.</w:t>
       </w:r>
     </w:p>
     <w:p>

</xml_diff>